<commit_message>
Update CV and portfolio details; enhance styling and layout for better presentation
Co-authored-by: Copilot <copilot@github.com>
</commit_message>
<xml_diff>
--- a/assets/CV.docx
+++ b/assets/CV.docx
@@ -114,7 +114,7 @@
         <w:rPr>
           <w:rFonts w:ascii="Droid Sans" w:eastAsia="g_d0_f2" w:hAnsi="Droid Sans" w:cs="g_d0_f2"/>
         </w:rPr>
-        <w:t>5</w:t>
+        <w:t>6</w:t>
       </w:r>
       <w:r>
         <w:rPr>
@@ -126,7 +126,25 @@
         <w:rPr>
           <w:rFonts w:ascii="Droid Sans" w:eastAsia="g_d0_f2" w:hAnsi="Droid Sans" w:cs="g_d0_f2"/>
         </w:rPr>
-        <w:t xml:space="preserve"> currently working at Flix Interactive on Sea of thieves. </w:t>
+        <w:t xml:space="preserve"> currently working at Flix Interactive</w:t>
+      </w:r>
+      <w:r>
+        <w:rPr>
+          <w:rFonts w:ascii="Droid Sans" w:eastAsia="g_d0_f2" w:hAnsi="Droid Sans" w:cs="g_d0_f2"/>
+        </w:rPr>
+        <w:t xml:space="preserve">, mostly working on networking and performance </w:t>
+      </w:r>
+      <w:r>
+        <w:rPr>
+          <w:rFonts w:ascii="Droid Sans" w:eastAsia="g_d0_f2" w:hAnsi="Droid Sans" w:cs="g_d0_f2"/>
+        </w:rPr>
+        <w:t>optimisations</w:t>
+      </w:r>
+      <w:r>
+        <w:rPr>
+          <w:rFonts w:ascii="Droid Sans" w:eastAsia="g_d0_f2" w:hAnsi="Droid Sans" w:cs="g_d0_f2"/>
+        </w:rPr>
+        <w:t xml:space="preserve">. </w:t>
       </w:r>
       <w:r>
         <w:rPr>
@@ -159,7 +177,19 @@
         <w:rPr>
           <w:rFonts w:ascii="Droid Sans" w:eastAsia="g_d0_f2" w:hAnsi="Droid Sans" w:cs="g_d0_f2"/>
         </w:rPr>
-        <w:t>, which has been an amazing project  that I got to work with my friend that taught us a lot of publishing a game and what polish is needed to actually release the game.</w:t>
+        <w:t xml:space="preserve">, which has been an amazing project that I got to work with my friend that taught us a lot of publishing a game and what polish is needed to </w:t>
+      </w:r>
+      <w:r>
+        <w:rPr>
+          <w:rFonts w:ascii="Droid Sans" w:eastAsia="g_d0_f2" w:hAnsi="Droid Sans" w:cs="g_d0_f2"/>
+        </w:rPr>
+        <w:t>release</w:t>
+      </w:r>
+      <w:r>
+        <w:rPr>
+          <w:rFonts w:ascii="Droid Sans" w:eastAsia="g_d0_f2" w:hAnsi="Droid Sans" w:cs="g_d0_f2"/>
+        </w:rPr>
+        <w:t xml:space="preserve"> the game.</w:t>
       </w:r>
     </w:p>
     <w:p>
@@ -234,7 +264,7 @@
                 <w:b/>
                 <w:bCs/>
               </w:rPr>
-              <w:t xml:space="preserve">Flix Interactive on Sea of Thieves, </w:t>
+              <w:t xml:space="preserve">Flix Interactive, </w:t>
             </w:r>
             <w:r>
               <w:rPr>
@@ -301,52 +331,80 @@
                 <w:sz w:val="20"/>
                 <w:szCs w:val="20"/>
               </w:rPr>
-              <w:t xml:space="preserve">While working on Sea of thieves I have worked on major updates to the game. While keeping to a strict budget for performance by making changes to the engine and gaining a deeper understanding of the </w:t>
-            </w:r>
-            <w:r>
-              <w:rPr>
-                <w:rFonts w:ascii="Droid Sans" w:eastAsia="Calibri" w:hAnsi="Droid Sans" w:cs="Calibri"/>
-                <w:sz w:val="20"/>
-                <w:szCs w:val="20"/>
-              </w:rPr>
-              <w:t>project</w:t>
-            </w:r>
-            <w:r>
-              <w:rPr>
-                <w:rFonts w:ascii="Droid Sans" w:eastAsia="Calibri" w:hAnsi="Droid Sans" w:cs="Calibri"/>
-                <w:sz w:val="20"/>
-                <w:szCs w:val="20"/>
-              </w:rPr>
-              <w:t>.</w:t>
-            </w:r>
-          </w:p>
-          <w:bookmarkEnd w:id="0"/>
-          <w:p>
-            <w:pPr>
-              <w:spacing w:before="20" w:after="20" w:line="252" w:lineRule="auto"/>
-              <w:rPr>
-                <w:rFonts w:ascii="Droid Sans" w:eastAsia="Calibri" w:hAnsi="Droid Sans" w:cs="Calibri"/>
-                <w:sz w:val="20"/>
-                <w:szCs w:val="20"/>
-              </w:rPr>
-            </w:pPr>
-          </w:p>
-          <w:p>
-            <w:pPr>
-              <w:spacing w:before="20" w:after="20" w:line="252" w:lineRule="auto"/>
-              <w:rPr>
-                <w:rFonts w:ascii="Droid Sans" w:eastAsia="Calibri" w:hAnsi="Droid Sans" w:cs="Calibri"/>
-                <w:sz w:val="20"/>
-                <w:szCs w:val="20"/>
-              </w:rPr>
-            </w:pPr>
-            <w:r>
-              <w:rPr>
-                <w:rFonts w:ascii="Droid Sans" w:eastAsia="Calibri" w:hAnsi="Droid Sans" w:cs="Calibri"/>
-                <w:sz w:val="20"/>
-                <w:szCs w:val="20"/>
-              </w:rPr>
-              <w:t>My main understanding on this project is networking and performance.</w:t>
+              <w:t>While working at Flix, my niche has become networking and performance optimisations</w:t>
+            </w:r>
+            <w:bookmarkEnd w:id="0"/>
+            <w:r>
+              <w:rPr>
+                <w:rFonts w:ascii="Droid Sans" w:eastAsia="Calibri" w:hAnsi="Droid Sans" w:cs="Calibri"/>
+                <w:sz w:val="20"/>
+                <w:szCs w:val="20"/>
+              </w:rPr>
+              <w:t xml:space="preserve"> mostly in unreal engine and even diving into custom engines on my own time which you can see in my blog.</w:t>
+            </w:r>
+          </w:p>
+          <w:p>
+            <w:pPr>
+              <w:spacing w:before="20" w:after="20" w:line="252" w:lineRule="auto"/>
+              <w:rPr>
+                <w:rFonts w:ascii="Droid Sans" w:eastAsia="Calibri" w:hAnsi="Droid Sans" w:cs="Calibri"/>
+                <w:sz w:val="20"/>
+                <w:szCs w:val="20"/>
+              </w:rPr>
+            </w:pPr>
+          </w:p>
+          <w:p>
+            <w:pPr>
+              <w:spacing w:before="20" w:after="20" w:line="252" w:lineRule="auto"/>
+              <w:rPr>
+                <w:rFonts w:ascii="Droid Sans" w:eastAsia="Calibri" w:hAnsi="Droid Sans" w:cs="Calibri"/>
+                <w:sz w:val="20"/>
+                <w:szCs w:val="20"/>
+              </w:rPr>
+            </w:pPr>
+            <w:r>
+              <w:rPr>
+                <w:rFonts w:ascii="Droid Sans" w:eastAsia="Calibri" w:hAnsi="Droid Sans" w:cs="Calibri"/>
+                <w:sz w:val="20"/>
+                <w:szCs w:val="20"/>
+              </w:rPr>
+              <w:t>Projects: Sea of thieves</w:t>
+            </w:r>
+          </w:p>
+          <w:p>
+            <w:pPr>
+              <w:spacing w:before="20" w:after="20" w:line="252" w:lineRule="auto"/>
+              <w:rPr>
+                <w:rFonts w:ascii="Droid Sans" w:eastAsia="Calibri" w:hAnsi="Droid Sans" w:cs="Calibri"/>
+                <w:sz w:val="20"/>
+                <w:szCs w:val="20"/>
+              </w:rPr>
+            </w:pPr>
+            <w:r>
+              <w:rPr>
+                <w:rFonts w:ascii="Droid Sans" w:eastAsia="Calibri" w:hAnsi="Droid Sans" w:cs="Calibri"/>
+                <w:sz w:val="20"/>
+                <w:szCs w:val="20"/>
+              </w:rPr>
+              <w:t>Power Wash Simulator 2</w:t>
+            </w:r>
+          </w:p>
+          <w:p>
+            <w:pPr>
+              <w:spacing w:before="20" w:after="20" w:line="252" w:lineRule="auto"/>
+              <w:rPr>
+                <w:rFonts w:ascii="Droid Sans" w:eastAsia="Calibri" w:hAnsi="Droid Sans" w:cs="Calibri"/>
+                <w:sz w:val="20"/>
+                <w:szCs w:val="20"/>
+              </w:rPr>
+            </w:pPr>
+            <w:r>
+              <w:rPr>
+                <w:rFonts w:ascii="Droid Sans" w:eastAsia="Calibri" w:hAnsi="Droid Sans" w:cs="Calibri"/>
+                <w:sz w:val="20"/>
+                <w:szCs w:val="20"/>
+              </w:rPr>
+              <w:t>2 Unnamed projects</w:t>
             </w:r>
           </w:p>
         </w:tc>
@@ -1452,18 +1510,8 @@
           <w:sz w:val="24"/>
           <w:szCs w:val="24"/>
         </w:rPr>
-        <w:t>/</w:t>
-      </w:r>
-      <w:proofErr w:type="spellStart"/>
-      <w:r>
-        <w:rPr>
-          <w:rFonts w:ascii="Droid Sans" w:eastAsia="Droid Sans" w:hAnsi="Droid Sans" w:cs="Droid Sans"/>
-          <w:sz w:val="24"/>
-          <w:szCs w:val="24"/>
-        </w:rPr>
-        <w:t>FiveM</w:t>
-      </w:r>
-      <w:proofErr w:type="spellEnd"/>
+        <w:t>/FiveM</w:t>
+      </w:r>
       <w:r>
         <w:rPr>
           <w:rFonts w:ascii="Droid Sans" w:eastAsia="Droid Sans" w:hAnsi="Droid Sans" w:cs="Droid Sans"/>

</xml_diff>